<commit_message>
docs: sync final manual adjustments
</commit_message>
<xml_diff>
--- a/docs/文档/01-需求规格说明书.docx
+++ b/docs/文档/01-需求规格说明书.docx
@@ -471,7 +471,13 @@
           <w:p>
             <w:pPr>
               <w:spacing w:line="360" w:lineRule="auto"/>
-              <w:jc w:val="center"/>
+              <w:ind w:left="0" w:leftChars="0" w:firstLine="0" w:firstLineChars="0"/>
+              <w:jc w:val="center"/>
+              <w:rPr>
+                <w:rFonts w:ascii="宋体" w:hAnsi="宋体" w:eastAsia="宋体"/>
+                <w:b/>
+                <w:sz w:val="24"/>
+              </w:rPr>
             </w:pPr>
             <w:r>
               <w:rPr>
@@ -493,14 +499,20 @@
           <w:p>
             <w:pPr>
               <w:spacing w:line="360" w:lineRule="auto"/>
-              <w:jc w:val="center"/>
-            </w:pPr>
-            <w:r>
+              <w:ind w:left="0" w:leftChars="0" w:firstLine="0" w:firstLineChars="0"/>
+              <w:jc w:val="center"/>
               <w:rPr>
                 <w:rFonts w:ascii="宋体" w:hAnsi="宋体" w:eastAsia="宋体"/>
                 <w:b/>
                 <w:sz w:val="24"/>
               </w:rPr>
+            </w:pPr>
+            <w:r>
+              <w:rPr>
+                <w:rFonts w:ascii="宋体" w:hAnsi="宋体" w:eastAsia="宋体"/>
+                <w:b/>
+                <w:sz w:val="24"/>
+              </w:rPr>
               <w:t>技术选型</w:t>
             </w:r>
           </w:p>
@@ -514,7 +526,13 @@
           <w:p>
             <w:pPr>
               <w:spacing w:line="360" w:lineRule="auto"/>
-              <w:jc w:val="center"/>
+              <w:ind w:left="0" w:leftChars="0" w:firstLine="0" w:firstLineChars="0"/>
+              <w:jc w:val="center"/>
+              <w:rPr>
+                <w:rFonts w:ascii="宋体" w:hAnsi="宋体" w:eastAsia="宋体"/>
+                <w:b/>
+                <w:sz w:val="24"/>
+              </w:rPr>
             </w:pPr>
             <w:r>
               <w:rPr>
@@ -917,7 +935,13 @@
           <w:p>
             <w:pPr>
               <w:spacing w:line="360" w:lineRule="auto"/>
-              <w:jc w:val="center"/>
+              <w:ind w:left="0" w:leftChars="0" w:firstLine="0" w:firstLineChars="0"/>
+              <w:jc w:val="center"/>
+              <w:rPr>
+                <w:rFonts w:ascii="宋体" w:hAnsi="宋体" w:eastAsia="宋体"/>
+                <w:b/>
+                <w:sz w:val="24"/>
+              </w:rPr>
             </w:pPr>
             <w:r>
               <w:rPr>
@@ -939,7 +963,13 @@
           <w:p>
             <w:pPr>
               <w:spacing w:line="360" w:lineRule="auto"/>
-              <w:jc w:val="center"/>
+              <w:ind w:left="0" w:leftChars="0" w:firstLine="0" w:firstLineChars="0"/>
+              <w:jc w:val="center"/>
+              <w:rPr>
+                <w:rFonts w:ascii="宋体" w:hAnsi="宋体" w:eastAsia="宋体"/>
+                <w:b/>
+                <w:sz w:val="24"/>
+              </w:rPr>
             </w:pPr>
             <w:r>
               <w:rPr>
@@ -1407,14 +1437,20 @@
           <w:p>
             <w:pPr>
               <w:spacing w:line="360" w:lineRule="auto"/>
-              <w:jc w:val="center"/>
-            </w:pPr>
-            <w:r>
+              <w:ind w:left="0" w:leftChars="0" w:firstLine="0" w:firstLineChars="0"/>
+              <w:jc w:val="center"/>
               <w:rPr>
                 <w:rFonts w:ascii="宋体" w:hAnsi="宋体" w:eastAsia="宋体"/>
                 <w:b/>
                 <w:sz w:val="24"/>
               </w:rPr>
+            </w:pPr>
+            <w:r>
+              <w:rPr>
+                <w:rFonts w:ascii="宋体" w:hAnsi="宋体" w:eastAsia="宋体"/>
+                <w:b/>
+                <w:sz w:val="24"/>
+              </w:rPr>
               <w:t>角色编码</w:t>
             </w:r>
           </w:p>
@@ -1428,14 +1464,20 @@
           <w:p>
             <w:pPr>
               <w:spacing w:line="360" w:lineRule="auto"/>
-              <w:jc w:val="center"/>
-            </w:pPr>
-            <w:r>
+              <w:ind w:left="0" w:leftChars="0" w:firstLine="0" w:firstLineChars="0"/>
+              <w:jc w:val="center"/>
               <w:rPr>
                 <w:rFonts w:ascii="宋体" w:hAnsi="宋体" w:eastAsia="宋体"/>
                 <w:b/>
                 <w:sz w:val="24"/>
               </w:rPr>
+            </w:pPr>
+            <w:r>
+              <w:rPr>
+                <w:rFonts w:ascii="宋体" w:hAnsi="宋体" w:eastAsia="宋体"/>
+                <w:b/>
+                <w:sz w:val="24"/>
+              </w:rPr>
               <w:t>角色名称</w:t>
             </w:r>
           </w:p>
@@ -1449,7 +1491,13 @@
           <w:p>
             <w:pPr>
               <w:spacing w:line="360" w:lineRule="auto"/>
-              <w:jc w:val="center"/>
+              <w:ind w:left="0" w:leftChars="0" w:firstLine="0" w:firstLineChars="0"/>
+              <w:jc w:val="center"/>
+              <w:rPr>
+                <w:rFonts w:ascii="宋体" w:hAnsi="宋体" w:eastAsia="宋体"/>
+                <w:b/>
+                <w:sz w:val="24"/>
+              </w:rPr>
             </w:pPr>
             <w:r>
               <w:rPr>
@@ -1789,7 +1837,13 @@
           <w:p>
             <w:pPr>
               <w:spacing w:line="360" w:lineRule="auto"/>
-              <w:jc w:val="center"/>
+              <w:ind w:left="0" w:leftChars="0" w:firstLine="0" w:firstLineChars="0"/>
+              <w:jc w:val="center"/>
+              <w:rPr>
+                <w:rFonts w:ascii="宋体" w:hAnsi="宋体" w:eastAsia="宋体"/>
+                <w:b/>
+                <w:sz w:val="24"/>
+              </w:rPr>
             </w:pPr>
             <w:r>
               <w:rPr>
@@ -1810,7 +1864,13 @@
           <w:p>
             <w:pPr>
               <w:spacing w:line="360" w:lineRule="auto"/>
-              <w:jc w:val="center"/>
+              <w:ind w:left="0" w:leftChars="0" w:firstLine="0" w:firstLineChars="0"/>
+              <w:jc w:val="center"/>
+              <w:rPr>
+                <w:rFonts w:ascii="宋体" w:hAnsi="宋体" w:eastAsia="宋体"/>
+                <w:b/>
+                <w:sz w:val="24"/>
+              </w:rPr>
             </w:pPr>
             <w:r>
               <w:rPr>
@@ -1831,7 +1891,13 @@
           <w:p>
             <w:pPr>
               <w:spacing w:line="360" w:lineRule="auto"/>
-              <w:jc w:val="center"/>
+              <w:ind w:left="0" w:leftChars="0" w:firstLine="0" w:firstLineChars="0"/>
+              <w:jc w:val="center"/>
+              <w:rPr>
+                <w:rFonts w:ascii="宋体" w:hAnsi="宋体" w:eastAsia="宋体"/>
+                <w:b/>
+                <w:sz w:val="24"/>
+              </w:rPr>
             </w:pPr>
             <w:r>
               <w:rPr>
@@ -1852,7 +1918,13 @@
           <w:p>
             <w:pPr>
               <w:spacing w:line="360" w:lineRule="auto"/>
-              <w:jc w:val="center"/>
+              <w:ind w:left="0" w:leftChars="0" w:firstLine="0" w:firstLineChars="0"/>
+              <w:jc w:val="center"/>
+              <w:rPr>
+                <w:rFonts w:ascii="宋体" w:hAnsi="宋体" w:eastAsia="宋体"/>
+                <w:b/>
+                <w:sz w:val="24"/>
+              </w:rPr>
             </w:pPr>
             <w:r>
               <w:rPr>
@@ -2971,14 +3043,20 @@
           <w:p>
             <w:pPr>
               <w:spacing w:line="360" w:lineRule="auto"/>
-              <w:jc w:val="center"/>
-            </w:pPr>
-            <w:r>
+              <w:ind w:left="0" w:leftChars="0" w:firstLine="0" w:firstLineChars="0"/>
+              <w:jc w:val="center"/>
               <w:rPr>
                 <w:rFonts w:ascii="宋体" w:hAnsi="宋体" w:eastAsia="宋体"/>
                 <w:b/>
                 <w:sz w:val="24"/>
               </w:rPr>
+            </w:pPr>
+            <w:r>
+              <w:rPr>
+                <w:rFonts w:ascii="宋体" w:hAnsi="宋体" w:eastAsia="宋体"/>
+                <w:b/>
+                <w:sz w:val="24"/>
+              </w:rPr>
               <w:t>编号</w:t>
             </w:r>
           </w:p>
@@ -2992,14 +3070,20 @@
           <w:p>
             <w:pPr>
               <w:spacing w:line="360" w:lineRule="auto"/>
-              <w:jc w:val="center"/>
-            </w:pPr>
-            <w:r>
+              <w:ind w:left="0" w:leftChars="0" w:firstLine="0" w:firstLineChars="0"/>
+              <w:jc w:val="center"/>
               <w:rPr>
                 <w:rFonts w:ascii="宋体" w:hAnsi="宋体" w:eastAsia="宋体"/>
                 <w:b/>
                 <w:sz w:val="24"/>
               </w:rPr>
+            </w:pPr>
+            <w:r>
+              <w:rPr>
+                <w:rFonts w:ascii="宋体" w:hAnsi="宋体" w:eastAsia="宋体"/>
+                <w:b/>
+                <w:sz w:val="24"/>
+              </w:rPr>
               <w:t>规则名称</w:t>
             </w:r>
           </w:p>
@@ -3013,7 +3097,13 @@
           <w:p>
             <w:pPr>
               <w:spacing w:line="360" w:lineRule="auto"/>
-              <w:jc w:val="center"/>
+              <w:ind w:left="0" w:leftChars="0" w:firstLine="0" w:firstLineChars="0"/>
+              <w:jc w:val="center"/>
+              <w:rPr>
+                <w:rFonts w:ascii="宋体" w:hAnsi="宋体" w:eastAsia="宋体"/>
+                <w:b/>
+                <w:sz w:val="24"/>
+              </w:rPr>
             </w:pPr>
             <w:r>
               <w:rPr>
@@ -3964,8 +4054,8 @@
         </w:tblCellMar>
       </w:tblPr>
       <w:tblGrid>
-        <w:gridCol w:w="2236"/>
-        <w:gridCol w:w="2236"/>
+        <w:gridCol w:w="2298"/>
+        <w:gridCol w:w="2174"/>
         <w:gridCol w:w="4056"/>
       </w:tblGrid>
       <w:tr>
@@ -3989,14 +4079,21 @@
           <w:p>
             <w:pPr>
               <w:spacing w:line="360" w:lineRule="auto"/>
-              <w:jc w:val="center"/>
-            </w:pPr>
-            <w:r>
+              <w:ind w:left="0" w:leftChars="0" w:firstLine="0" w:firstLineChars="0"/>
+              <w:jc w:val="center"/>
               <w:rPr>
                 <w:rFonts w:ascii="宋体" w:hAnsi="宋体" w:eastAsia="宋体"/>
                 <w:b/>
                 <w:sz w:val="24"/>
               </w:rPr>
+            </w:pPr>
+            <w:bookmarkStart w:id="0" w:name="_GoBack" w:colFirst="0" w:colLast="2"/>
+            <w:r>
+              <w:rPr>
+                <w:rFonts w:ascii="宋体" w:hAnsi="宋体" w:eastAsia="宋体"/>
+                <w:b/>
+                <w:sz w:val="24"/>
+              </w:rPr>
               <w:t>编号</w:t>
             </w:r>
           </w:p>
@@ -4010,14 +4107,20 @@
           <w:p>
             <w:pPr>
               <w:spacing w:line="360" w:lineRule="auto"/>
-              <w:jc w:val="center"/>
-            </w:pPr>
-            <w:r>
+              <w:ind w:left="0" w:leftChars="0" w:firstLine="0" w:firstLineChars="0"/>
+              <w:jc w:val="center"/>
               <w:rPr>
                 <w:rFonts w:ascii="宋体" w:hAnsi="宋体" w:eastAsia="宋体"/>
                 <w:b/>
                 <w:sz w:val="24"/>
               </w:rPr>
+            </w:pPr>
+            <w:r>
+              <w:rPr>
+                <w:rFonts w:ascii="宋体" w:hAnsi="宋体" w:eastAsia="宋体"/>
+                <w:b/>
+                <w:sz w:val="24"/>
+              </w:rPr>
               <w:t>维度</w:t>
             </w:r>
           </w:p>
@@ -4031,19 +4134,26 @@
           <w:p>
             <w:pPr>
               <w:spacing w:line="360" w:lineRule="auto"/>
-              <w:jc w:val="center"/>
-            </w:pPr>
-            <w:r>
+              <w:ind w:left="0" w:leftChars="0" w:firstLine="0" w:firstLineChars="0"/>
+              <w:jc w:val="center"/>
               <w:rPr>
                 <w:rFonts w:ascii="宋体" w:hAnsi="宋体" w:eastAsia="宋体"/>
                 <w:b/>
                 <w:sz w:val="24"/>
               </w:rPr>
+            </w:pPr>
+            <w:r>
+              <w:rPr>
+                <w:rFonts w:ascii="宋体" w:hAnsi="宋体" w:eastAsia="宋体"/>
+                <w:b/>
+                <w:sz w:val="24"/>
+              </w:rPr>
               <w:t>当前要求</w:t>
             </w:r>
           </w:p>
         </w:tc>
       </w:tr>
+      <w:bookmarkEnd w:id="0"/>
       <w:tr>
         <w:tblPrEx>
           <w:tblCellMar>
@@ -4568,8 +4678,6 @@
         </w:rPr>
         <w:t>通知、审计日志和部分运行态信息保存在 Redis 中，不属于 MySQL 主表结构的一部分。</w:t>
       </w:r>
-      <w:bookmarkStart w:id="0" w:name="_GoBack"/>
-      <w:bookmarkEnd w:id="0"/>
     </w:p>
     <w:sectPr>
       <w:pgSz w:w="11906" w:h="16838"/>

</xml_diff>